<commit_message>
Agrega sketches de Arduino IDE para ESP32 + Factory I/O y documenta la guía
- Fase_1_Digital y Fase_2_Analogico como sketches .ino (Modbus TCP, ESP32 servidor)
- Credenciales Wi-Fi en secrets.h (ignorado por git) con plantilla secrets.example.h
- README y guía docx actualizados: preparación del entorno, secrets.h y diagnóstico
</commit_message>
<xml_diff>
--- a/guia_esp32_factory_io.docx
+++ b/guia_esp32_factory_io.docx
@@ -686,7 +686,7 @@
           <w:color w:val="2D3748"/>
           <w:sz w:val="21"/>
         </w:rPr>
-        <w:t>En Arduino IDE, asegúrate de tener instalado el paquete 'esp32 by Espressif Systems' desde el Gestor de Tarjetas (o el framework arduino-esp32 en PlatformIO).</w:t>
+        <w:t>En Arduino IDE (2.x), abre el Gestor de Tarjetas, instala el paquete 'esp32 by Espressif Systems' (versión 3.0 o superior, necesaria para analogWrite) y elige la placa 'ESP32 Dev Module'.</w:t>
       </w:r>
     </w:p>
     <w:p>
@@ -733,6 +733,92 @@
           <w:sz w:val="21"/>
         </w:rPr>
         <w:t>Conecta tu PC (donde corre Factory I/O) y el ESP32 a la misma red Wi-Fi de 2.4 GHz. Verifica que el firewall de Windows permita tráfico en el puerto TCP 502.</w:t>
+      </w:r>
+    </w:p>
+    <w:p>
+      <w:pPr>
+        <w:pStyle w:val="ListBullet"/>
+        <w:spacing w:before="40" w:after="80" w:line="276" w:lineRule="auto"/>
+      </w:pPr>
+      <w:r>
+        <w:rPr>
+          <w:rFonts w:ascii="Segoe UI" w:hAnsi="Segoe UI"/>
+          <w:b/>
+          <w:color w:val="0D233A"/>
+          <w:sz w:val="21"/>
+        </w:rPr>
+        <w:t xml:space="preserve">4. Credenciales Wi-Fi (secrets.h): </w:t>
+      </w:r>
+      <w:r>
+        <w:rPr>
+          <w:rFonts w:ascii="Segoe UI" w:hAnsi="Segoe UI"/>
+          <w:color w:val="2D3748"/>
+          <w:sz w:val="21"/>
+        </w:rPr>
+        <w:t xml:space="preserve">La clave de tu red NO se escribe dentro del sketch: se lee de un archivo aparte llamado secrets.h. En la carpeta del sketch copia el archivo secrets.example.h y renombra la copia a secrets.h. Ábrelo (aparece como una pestaña más del Arduino IDE) y escribe los datos de tu red de 2.4 GHz:</w:t>
+      </w:r>
+    </w:p>
+    <w:p>
+      <w:pPr>
+        <w:shd w:val="clear" w:color="auto" w:fill="F8F9FA"/>
+        <w:spacing w:before="40" w:after="120"/>
+        <w:ind w:left="720"/>
+      </w:pPr>
+      <w:r>
+        <w:rPr>
+          <w:rFonts w:ascii="Consolas" w:hAnsi="Consolas"/>
+          <w:color w:val="1E293B"/>
+          <w:sz w:val="18"/>
+        </w:rPr>
+        <w:t xml:space="preserve">#define WIFI_SSID     "NombreDeTuRed"</w:t>
+        <w:br/>
+        <w:t xml:space="preserve">#define WIFI_PASSWORD "ClaveDeTuRed"</w:t>
+      </w:r>
+    </w:p>
+    <w:p>
+      <w:pPr>
+        <w:pStyle w:val="ListBullet"/>
+        <w:spacing w:before="40" w:after="80" w:line="276" w:lineRule="auto"/>
+      </w:pPr>
+      <w:r>
+        <w:rPr>
+          <w:rFonts w:ascii="Segoe UI" w:hAnsi="Segoe UI"/>
+          <w:b/>
+          <w:color w:val="0D233A"/>
+          <w:sz w:val="21"/>
+        </w:rPr>
+        <w:t xml:space="preserve">5. Cómo lo usa el sketch: </w:t>
+      </w:r>
+      <w:r>
+        <w:rPr>
+          <w:rFonts w:ascii="Segoe UI" w:hAnsi="Segoe UI"/>
+          <w:color w:val="2D3748"/>
+          <w:sz w:val="21"/>
+        </w:rPr>
+        <w:t xml:space="preserve">El programa incluye el archivo con #include "secrets.h" y conecta con WiFi.begin(WIFI_SSID, WIFI_PASSWORD). Así el código se puede compartir o subir a GitHub sin exponer la clave: secrets.h está en .gitignore y solo se versiona la plantilla secrets.example.h.</w:t>
+      </w:r>
+    </w:p>
+    <w:p>
+      <w:pPr>
+        <w:pStyle w:val="ListBullet"/>
+        <w:spacing w:before="40" w:after="80" w:line="276" w:lineRule="auto"/>
+      </w:pPr>
+      <w:r>
+        <w:rPr>
+          <w:rFonts w:ascii="Segoe UI" w:hAnsi="Segoe UI"/>
+          <w:b/>
+          <w:color w:val="0D233A"/>
+          <w:sz w:val="21"/>
+        </w:rPr>
+        <w:t xml:space="preserve">6. Estructura de carpetas: </w:t>
+      </w:r>
+      <w:r>
+        <w:rPr>
+          <w:rFonts w:ascii="Segoe UI" w:hAnsi="Segoe UI"/>
+          <w:color w:val="2D3748"/>
+          <w:sz w:val="21"/>
+        </w:rPr>
+        <w:t xml:space="preserve">El Arduino IDE exige que la carpeta del sketch se llame igual que el .ino (por ejemplo Fase_1_Digital/Fase_1_Digital.ino). Cada sketch lleva su propio secrets.h en esa misma carpeta.</w:t>
       </w:r>
     </w:p>
     <w:p>
@@ -1317,22 +1403,17 @@
               <w:br/>
               <w:t>#include &lt;ModbusIP_ESP8266.h&gt;</w:t>
               <w:br/>
-              <w:br/>
-              <w:t>// 1. Credenciales Wi-Fi (Red 2.4 GHz)</w:t>
-              <w:br/>
-              <w:t>const char* ssid = "TU_WIFI_SSID";</w:t>
-              <w:br/>
-              <w:t>const char* password = "TU_WIFI_PASSWORD";</w:t>
+              <w:t>#include "secrets.h" // Define WIFI_SSID y WIFI_PASSWORD (ver secrets.example.h)</w:t>
               <w:br/>
               <w:br/>
-              <w:t>// 2. Direcciones de Registros Modbus (Offset 0)</w:t>
+              <w:t>// 1. Direcciones de Registros Modbus (Offset 0)</w:t>
               <w:br/>
               <w:t>const int COIL_SENSOR_FIO  = 0; // Factory IO escribe aquí el estado del Sensor (Coil 0)</w:t>
               <w:br/>
               <w:t>const int ISTS_MOTOR_FIO   = 0; // Factory IO lee de aquí para mover la Banda (Input 0)</w:t>
               <w:br/>
               <w:br/>
-              <w:t>// 3. Pines físicos del ESP32</w:t>
+              <w:t>// 2. Pines físicos del ESP32</w:t>
               <w:br/>
               <w:t>const int PIN_LED_ESTADO   = 2; // LED integrado en la placa ESP32</w:t>
               <w:br/>
@@ -1353,9 +1434,9 @@
               <w:t xml:space="preserve">  pinMode(PIN_BOTON_MARCHA, INPUT_PULLUP);</w:t>
               <w:br/>
               <w:br/>
-              <w:t xml:space="preserve">  // Conexión a la red Wi-Fi</w:t>
+              <w:t xml:space="preserve">  // Conexión a la red Wi-Fi (credenciales leídas de secrets.h)</w:t>
               <w:br/>
-              <w:t xml:space="preserve">  WiFi.begin(ssid, password);</w:t>
+              <w:t xml:space="preserve">  WiFi.begin(WIFI_SSID, WIFI_PASSWORD);</w:t>
               <w:br/>
               <w:t xml:space="preserve">  Serial.print("Conectando a WiFi");</w:t>
               <w:br/>
@@ -2472,15 +2553,10 @@
               <w:br/>
               <w:t>#include &lt;ModbusIP_ESP8266.h&gt;</w:t>
               <w:br/>
-              <w:br/>
-              <w:t>// 1. Credenciales Wi-Fi</w:t>
-              <w:br/>
-              <w:t>const char* ssid = "TU_WIFI_SSID";</w:t>
-              <w:br/>
-              <w:t>const char* password = "TU_WIFI_PASSWORD";</w:t>
+              <w:t>#include "secrets.h" // Define WIFI_SSID y WIFI_PASSWORD (ver secrets.example.h)</w:t>
               <w:br/>
               <w:br/>
-              <w:t>// 2. Direcciones Modbus (Offset 0)</w:t>
+              <w:t>// 1. Direcciones Modbus (Offset 0)</w:t>
               <w:br/>
               <w:t>const int COIL_SENSOR_DIGITAL = 0; // FIO escribe sensor digital aquí (Coil 0)</w:t>
               <w:br/>
@@ -2491,7 +2567,7 @@
               <w:t>const int IREG_POT_ESP32      = 0; // FIO lee potenciómetro del ESP32 aquí (Input Reg 0)</w:t>
               <w:br/>
               <w:br/>
-              <w:t>// 3. Pines de Hardware en el ESP32</w:t>
+              <w:t>// 2. Pines de Hardware en el ESP32</w:t>
               <w:br/>
               <w:t>const int PIN_LED_DIGITAL = 2;  // LED indicador digital</w:t>
               <w:br/>
@@ -2523,9 +2599,9 @@
               <w:t xml:space="preserve">  analogReadResolution(12); // Resolución ADC de 12 bits (0 a 4095)</w:t>
               <w:br/>
               <w:br/>
-              <w:t xml:space="preserve">  // Conectar a Wi-Fi</w:t>
+              <w:t xml:space="preserve">  // Conectar a Wi-Fi (credenciales leídas de secrets.h)</w:t>
               <w:br/>
-              <w:t xml:space="preserve">  WiFi.begin(ssid, password);</w:t>
+              <w:t xml:space="preserve">  WiFi.begin(WIFI_SSID, WIFI_PASSWORD);</w:t>
               <w:br/>
               <w:t xml:space="preserve">  Serial.print("Conectando a WiFi");</w:t>
               <w:br/>
@@ -3018,6 +3094,162 @@
           </w:p>
         </w:tc>
       </w:tr>
+      <w:tr>
+        <w:tc>
+          <w:tcPr>
+            <w:tcW w:type="dxa" w:w="3312"/>
+            <w:shd w:fill="FFFFFF"/>
+            <w:tcMar>
+              <w:top w:w="100" w:type="dxa"/>
+              <w:bottom w:w="100" w:type="dxa"/>
+              <w:left w:w="140" w:type="dxa"/>
+              <w:right w:w="140" w:type="dxa"/>
+            </w:tcMar>
+          </w:tcPr>
+          <w:p>
+            <w:pPr>
+              <w:spacing w:before="0" w:after="0"/>
+            </w:pPr>
+            <w:r>
+              <w:rPr>
+                <w:rFonts w:ascii="Segoe UI" w:hAnsi="Segoe UI"/>
+                <w:b/>
+                <w:color w:val="0D233A"/>
+                <w:sz w:val="19"/>
+              </w:rPr>
+              <w:t>Error al compilar: fatal error: secrets.h: No such file or directory</w:t>
+            </w:r>
+          </w:p>
+        </w:tc>
+        <w:tc>
+          <w:tcPr>
+            <w:tcW w:type="dxa" w:w="3312"/>
+            <w:shd w:fill="FFFFFF"/>
+            <w:tcMar>
+              <w:top w:w="100" w:type="dxa"/>
+              <w:bottom w:w="100" w:type="dxa"/>
+              <w:left w:w="140" w:type="dxa"/>
+              <w:right w:w="140" w:type="dxa"/>
+            </w:tcMar>
+          </w:tcPr>
+          <w:p>
+            <w:pPr>
+              <w:spacing w:before="0" w:after="0"/>
+            </w:pPr>
+            <w:r>
+              <w:rPr>
+                <w:rFonts w:ascii="Segoe UI" w:hAnsi="Segoe UI"/>
+                <w:color w:val="2D3748"/>
+                <w:sz w:val="19"/>
+              </w:rPr>
+              <w:t>Falta crear secrets.h en la carpeta del sketch (solo existe secrets.example.h).</w:t>
+            </w:r>
+          </w:p>
+        </w:tc>
+        <w:tc>
+          <w:tcPr>
+            <w:tcW w:type="dxa" w:w="3312"/>
+            <w:shd w:fill="FFFFFF"/>
+            <w:tcMar>
+              <w:top w:w="100" w:type="dxa"/>
+              <w:bottom w:w="100" w:type="dxa"/>
+              <w:left w:w="140" w:type="dxa"/>
+              <w:right w:w="140" w:type="dxa"/>
+            </w:tcMar>
+          </w:tcPr>
+          <w:p>
+            <w:pPr>
+              <w:spacing w:before="0" w:after="0"/>
+            </w:pPr>
+            <w:r>
+              <w:rPr>
+                <w:rFonts w:ascii="Segoe UI" w:hAnsi="Segoe UI"/>
+                <w:color w:val="2D3748"/>
+                <w:sz w:val="19"/>
+              </w:rPr>
+              <w:t>Copia secrets.example.h, renómbralo a secrets.h y escribe el nombre y la clave de tu red.</w:t>
+            </w:r>
+          </w:p>
+        </w:tc>
+      </w:tr>
+      <w:tr>
+        <w:tc>
+          <w:tcPr>
+            <w:tcW w:type="dxa" w:w="3312"/>
+            <w:shd w:fill="FFFFFF"/>
+            <w:tcMar>
+              <w:top w:w="100" w:type="dxa"/>
+              <w:bottom w:w="100" w:type="dxa"/>
+              <w:left w:w="140" w:type="dxa"/>
+              <w:right w:w="140" w:type="dxa"/>
+            </w:tcMar>
+          </w:tcPr>
+          <w:p>
+            <w:pPr>
+              <w:spacing w:before="0" w:after="0"/>
+            </w:pPr>
+            <w:r>
+              <w:rPr>
+                <w:rFonts w:ascii="Segoe UI" w:hAnsi="Segoe UI"/>
+                <w:b/>
+                <w:color w:val="0D233A"/>
+                <w:sz w:val="19"/>
+              </w:rPr>
+              <w:t>Error al compilar: 'analogWrite' was not declared</w:t>
+            </w:r>
+          </w:p>
+        </w:tc>
+        <w:tc>
+          <w:tcPr>
+            <w:tcW w:type="dxa" w:w="3312"/>
+            <w:shd w:fill="FFFFFF"/>
+            <w:tcMar>
+              <w:top w:w="100" w:type="dxa"/>
+              <w:bottom w:w="100" w:type="dxa"/>
+              <w:left w:w="140" w:type="dxa"/>
+              <w:right w:w="140" w:type="dxa"/>
+            </w:tcMar>
+          </w:tcPr>
+          <w:p>
+            <w:pPr>
+              <w:spacing w:before="0" w:after="0"/>
+            </w:pPr>
+            <w:r>
+              <w:rPr>
+                <w:rFonts w:ascii="Segoe UI" w:hAnsi="Segoe UI"/>
+                <w:color w:val="2D3748"/>
+                <w:sz w:val="19"/>
+              </w:rPr>
+              <w:t>El paquete 'esp32 by Espressif Systems' instalado es anterior a la versión 3.0.</w:t>
+            </w:r>
+          </w:p>
+        </w:tc>
+        <w:tc>
+          <w:tcPr>
+            <w:tcW w:type="dxa" w:w="3312"/>
+            <w:shd w:fill="FFFFFF"/>
+            <w:tcMar>
+              <w:top w:w="100" w:type="dxa"/>
+              <w:bottom w:w="100" w:type="dxa"/>
+              <w:left w:w="140" w:type="dxa"/>
+              <w:right w:w="140" w:type="dxa"/>
+            </w:tcMar>
+          </w:tcPr>
+          <w:p>
+            <w:pPr>
+              <w:spacing w:before="0" w:after="0"/>
+            </w:pPr>
+            <w:r>
+              <w:rPr>
+                <w:rFonts w:ascii="Segoe UI" w:hAnsi="Segoe UI"/>
+                <w:color w:val="2D3748"/>
+                <w:sz w:val="19"/>
+              </w:rPr>
+              <w:t>Actualiza el paquete desde el Gestor de Tarjetas a la versión 3.0 o superior.</w:t>
+            </w:r>
+          </w:p>
+        </w:tc>
+      </w:tr>
     </w:tbl>
     <w:p>
       <w:pPr>

</xml_diff>

<commit_message>
Agrega imagen de instalación de modbus-esp8266 y guía de firewall/puerto 502
- Imagen del Gestor de Librerías en README y guía docx
- Explica el puerto 502, Test-NetConnection y reglas de firewall en README y guía
</commit_message>
<xml_diff>
--- a/guia_esp32_factory_io.docx
+++ b/guia_esp32_factory_io.docx
@@ -714,6 +714,64 @@
     </w:p>
     <w:p>
       <w:pPr>
+        <w:keepNext/>
+        <w:spacing w:before="80" w:after="40"/>
+        <w:jc w:val="center"/>
+      </w:pPr>
+      <w:r>
+        <w:drawing>
+          <wp:inline distT="0" distB="0" distL="0" distR="0">
+            <wp:extent cx="2560320" cy="2655012"/>
+            <wp:docPr id="9001" name="Instalación modbus-esp8266" descr="Gestor de Librerías del Arduino IDE con modbus-esp8266 versión 4.1.0 instalada"/>
+            <wp:cNvGraphicFramePr>
+              <a:graphicFrameLocks xmlns:a="http://schemas.openxmlformats.org/drawingml/2006/main" noChangeAspect="1"/>
+            </wp:cNvGraphicFramePr>
+            <a:graphic xmlns:a="http://schemas.openxmlformats.org/drawingml/2006/main">
+              <a:graphicData uri="http://schemas.openxmlformats.org/drawingml/2006/picture">
+                <pic:pic xmlns:pic="http://schemas.openxmlformats.org/drawingml/2006/picture">
+                  <pic:nvPicPr>
+                    <pic:cNvPr id="9001" name="instalacion_modbus_esp8266.jpg"/>
+                    <pic:cNvPicPr/>
+                  </pic:nvPicPr>
+                  <pic:blipFill>
+                    <a:blip r:embed="rIdImgModbus"/>
+                    <a:stretch>
+                      <a:fillRect/>
+                    </a:stretch>
+                  </pic:blipFill>
+                  <pic:spPr>
+                    <a:xfrm>
+                      <a:off x="0" y="0"/>
+                      <a:ext cx="2560320" cy="2655012"/>
+                    </a:xfrm>
+                    <a:prstGeom prst="rect">
+                      <a:avLst/>
+                    </a:prstGeom>
+                  </pic:spPr>
+                </pic:pic>
+              </a:graphicData>
+            </a:graphic>
+          </wp:inline>
+        </w:drawing>
+      </w:r>
+    </w:p>
+    <w:p>
+      <w:pPr>
+        <w:spacing w:before="0" w:after="120"/>
+        <w:jc w:val="center"/>
+      </w:pPr>
+      <w:r>
+        <w:rPr>
+          <w:rFonts w:ascii="Segoe UI" w:hAnsi="Segoe UI"/>
+          <w:i/>
+          <w:color w:val="64748B"/>
+          <w:sz w:val="18"/>
+        </w:rPr>
+        <w:t>Figura 1. Búsqueda e instalación de modbus-esp8266 en el Gestor de Librerías.</w:t>
+      </w:r>
+    </w:p>
+    <w:p>
+      <w:pPr>
         <w:pStyle w:val="ListBullet"/>
         <w:spacing w:before="40" w:after="80" w:line="276" w:lineRule="auto"/>
       </w:pPr>
@@ -732,7 +790,7 @@
           <w:color w:val="2D3748"/>
           <w:sz w:val="21"/>
         </w:rPr>
-        <w:t>Conecta tu PC (donde corre Factory I/O) y el ESP32 a la misma red Wi-Fi de 2.4 GHz. Verifica que el firewall de Windows permita tráfico en el puerto TCP 502.</w:t>
+        <w:t>Conecta tu PC (donde corre Factory I/O) y el ESP32 a la misma red Wi-Fi de 2.4 GHz. Si Factory I/O no logra conectar, revisa el firewall (ver el punto 7).</w:t>
       </w:r>
     </w:p>
     <w:p>
@@ -819,6 +877,153 @@
           <w:sz w:val="21"/>
         </w:rPr>
         <w:t xml:space="preserve">El Arduino IDE exige que la carpeta del sketch se llame igual que el .ino (por ejemplo Fase_1_Digital/Fase_1_Digital.ino). Cada sketch lleva su propio secrets.h en esa misma carpeta.</w:t>
+      </w:r>
+    </w:p>
+    <w:p>
+      <w:pPr>
+        <w:pStyle w:val="ListBullet"/>
+        <w:spacing w:before="40" w:after="80" w:line="276" w:lineRule="auto"/>
+      </w:pPr>
+      <w:r>
+        <w:rPr>
+          <w:rFonts w:ascii="Segoe UI" w:hAnsi="Segoe UI"/>
+          <w:b/>
+          <w:color w:val="0D233A"/>
+          <w:sz w:val="21"/>
+        </w:rPr>
+        <w:t xml:space="preserve">7. Firewall de Windows y puerto 502: </w:t>
+      </w:r>
+      <w:r>
+        <w:rPr>
+          <w:rFonts w:ascii="Segoe UI" w:hAnsi="Segoe UI"/>
+          <w:color w:val="2D3748"/>
+          <w:sz w:val="21"/>
+        </w:rPr>
+        <w:t xml:space="preserve">El puerto 502 es el de Modbus TCP: el ESP32 escucha en él y Factory I/O (en el PC) se conecta a él. El firewall es el filtro que decide qué conexiones pasan. Como el PC es quien inicia la conexión, normalmente Windows la permite sin configurar nada. Solo si Factory I/O muestra el triángulo rojo al pulsar CONNECT, comprueba la conexión desde PowerShell (cambia la IP por la que imprime el Monitor Serie):</w:t>
+      </w:r>
+    </w:p>
+    <w:p>
+      <w:pPr>
+        <w:shd w:val="clear" w:color="auto" w:fill="F8F9FA"/>
+        <w:spacing w:before="40" w:after="120"/>
+        <w:ind w:left="720"/>
+      </w:pPr>
+      <w:r>
+        <w:rPr>
+          <w:rFonts w:ascii="Consolas" w:hAnsi="Consolas"/>
+          <w:color w:val="1E293B"/>
+          <w:sz w:val="18"/>
+        </w:rPr>
+        <w:t xml:space="preserve">Test-NetConnection 192.168.1.50 -Port 502</w:t>
+      </w:r>
+    </w:p>
+    <w:p>
+      <w:pPr>
+        <w:pStyle w:val="ListBullet"/>
+        <w:spacing w:before="40" w:after="80" w:line="276" w:lineRule="auto"/>
+      </w:pPr>
+      <w:r>
+        <w:rPr>
+          <w:rFonts w:ascii="Segoe UI" w:hAnsi="Segoe UI"/>
+          <w:b/>
+          <w:color w:val="0D233A"/>
+          <w:sz w:val="21"/>
+        </w:rPr>
+        <w:t xml:space="preserve">   • TcpTestSucceeded : True → </w:t>
+      </w:r>
+      <w:r>
+        <w:rPr>
+          <w:rFonts w:ascii="Segoe UI" w:hAnsi="Segoe UI"/>
+          <w:color w:val="2D3748"/>
+          <w:sz w:val="21"/>
+        </w:rPr>
+        <w:t xml:space="preserve">el firewall no es el problema; revisa que la IP y el Host de Factory I/O coincidan.</w:t>
+      </w:r>
+    </w:p>
+    <w:p>
+      <w:pPr>
+        <w:pStyle w:val="ListBullet"/>
+        <w:spacing w:before="40" w:after="80" w:line="276" w:lineRule="auto"/>
+      </w:pPr>
+      <w:r>
+        <w:rPr>
+          <w:rFonts w:ascii="Segoe UI" w:hAnsi="Segoe UI"/>
+          <w:b/>
+          <w:color w:val="0D233A"/>
+          <w:sz w:val="21"/>
+        </w:rPr>
+        <w:t xml:space="preserve">   • False → </w:t>
+      </w:r>
+      <w:r>
+        <w:rPr>
+          <w:rFonts w:ascii="Segoe UI" w:hAnsi="Segoe UI"/>
+          <w:color w:val="2D3748"/>
+          <w:sz w:val="21"/>
+        </w:rPr>
+        <w:t xml:space="preserve">el ESP32 no responde: revisa que PC y ESP32 estén en la misma red (algunos routers de laboratorio aíslan los dispositivos Wi-Fi entre sí), que el ESP32 esté encendido y que la IP sea la correcta.</w:t>
+      </w:r>
+    </w:p>
+    <w:p>
+      <w:pPr>
+        <w:pStyle w:val="ListBullet"/>
+        <w:spacing w:before="40" w:after="80" w:line="276" w:lineRule="auto"/>
+      </w:pPr>
+      <w:r>
+        <w:rPr>
+          <w:rFonts w:ascii="Segoe UI" w:hAnsi="Segoe UI"/>
+          <w:b/>
+          <w:color w:val="0D233A"/>
+          <w:sz w:val="21"/>
+        </w:rPr>
+        <w:t xml:space="preserve">   • Permitir Factory I/O: </w:t>
+      </w:r>
+      <w:r>
+        <w:rPr>
+          <w:rFonts w:ascii="Segoe UI" w:hAnsi="Segoe UI"/>
+          <w:color w:val="2D3748"/>
+          <w:sz w:val="21"/>
+        </w:rPr>
+        <w:t xml:space="preserve">Configuración → Privacidad y seguridad → Seguridad de Windows → Firewall y protección de red → Permitir una aplicación a través del firewall → Cambiar la configuración → Permitir otra aplicación… → elige FACTORY IO y marca las casillas Privada y Pública.</w:t>
+      </w:r>
+    </w:p>
+    <w:p>
+      <w:pPr>
+        <w:pStyle w:val="ListBullet"/>
+        <w:spacing w:before="40" w:after="80" w:line="276" w:lineRule="auto"/>
+      </w:pPr>
+      <w:r>
+        <w:rPr>
+          <w:rFonts w:ascii="Segoe UI" w:hAnsi="Segoe UI"/>
+          <w:b/>
+          <w:color w:val="0D233A"/>
+          <w:sz w:val="21"/>
+        </w:rPr>
+        <w:t xml:space="preserve">   • Regla explícita (opcional): </w:t>
+      </w:r>
+      <w:r>
+        <w:rPr>
+          <w:rFonts w:ascii="Segoe UI" w:hAnsi="Segoe UI"/>
+          <w:color w:val="2D3748"/>
+          <w:sz w:val="21"/>
+        </w:rPr>
+        <w:t xml:space="preserve">abre PowerShell como administrador y ejecuta:</w:t>
+      </w:r>
+    </w:p>
+    <w:p>
+      <w:pPr>
+        <w:shd w:val="clear" w:color="auto" w:fill="F8F9FA"/>
+        <w:spacing w:before="40" w:after="120"/>
+        <w:ind w:left="720"/>
+      </w:pPr>
+      <w:r>
+        <w:rPr>
+          <w:rFonts w:ascii="Consolas" w:hAnsi="Consolas"/>
+          <w:color w:val="1E293B"/>
+          <w:sz w:val="18"/>
+        </w:rPr>
+        <w:t xml:space="preserve">New-NetFirewallRule -DisplayName "Factory IO Modbus TCP 502" -Direction Inbound -Protocol TCP -LocalPort 502 -Action Allow</w:t>
+        <w:br/>
+        <w:t xml:space="preserve">New-NetFirewallRule -DisplayName "Factory IO Modbus TCP 502 (salida)" -Direction Outbound -Protocol TCP -RemotePort 502 -Action Allow</w:t>
       </w:r>
     </w:p>
     <w:p>

</xml_diff>

<commit_message>
Ajusta la configuración de Factory I/O a los nombres reales de la ventana
- Captura de la configuración del driver Modbus TCP/IP Client
- I/O Config (Read Digital/Register, Scale) e I/O Points (Digital/Register Inputs y Outputs)
- Tabla de equivalencias entre Factory I/O y los registros Modbus del ESP32
</commit_message>
<xml_diff>
--- a/guia_esp32_factory_io.docx
+++ b/guia_esp32_factory_io.docx
@@ -1511,7 +1511,7 @@
           <w:color w:val="2D3748"/>
           <w:sz w:val="21"/>
         </w:rPr>
-        <w:t>En la sección I/O Points, verifica que 'Coils' (Inputs de FIO) tenga Count = 8 y 'Inputs' (Outputs de FIO / Discrete Inputs) tenga Count = 8.</w:t>
+        <w:t xml:space="preserve">En 'I/O Config' deja 'Read Digital' en Inputs, 'Read Register' en Input Registers y pon 'Scale' en 100. En 'I/O Points' (Offset 0) verifica que 'Digital Inputs' y 'Digital Outputs' tengan un Count de al menos 8 (por defecto aparecen 16).</w:t>
       </w:r>
     </w:p>
     <w:p>
@@ -1535,6 +1535,179 @@
           <w:sz w:val="21"/>
         </w:rPr>
         <w:t>Regresa a la ventana del driver y arrastra un sensor (ej. Diffuse Sensor 0) a 'Coil 0', y un actuador (ej. Conveyor) a 'Input 0'.</w:t>
+      </w:r>
+    </w:p>
+    <w:p>
+      <w:pPr>
+        <w:keepNext/>
+        <w:spacing w:before="80" w:after="40"/>
+        <w:jc w:val="center"/>
+      </w:pPr>
+      <w:r>
+        <w:drawing>
+          <wp:inline distT="0" distB="0" distL="0" distR="0">
+            <wp:extent cx="2377440" cy="2925378"/>
+            <wp:docPr id="9002" name="Configuración Modbus Factory IO" descr="Ventana de configuración del driver Modbus TCP/IP Client en Factory I/O"/>
+            <wp:cNvGraphicFramePr>
+              <a:graphicFrameLocks xmlns:a="http://schemas.openxmlformats.org/drawingml/2006/main" noChangeAspect="1"/>
+            </wp:cNvGraphicFramePr>
+            <a:graphic xmlns:a="http://schemas.openxmlformats.org/drawingml/2006/main">
+              <a:graphicData uri="http://schemas.openxmlformats.org/drawingml/2006/picture">
+                <pic:pic xmlns:pic="http://schemas.openxmlformats.org/drawingml/2006/picture">
+                  <pic:nvPicPr>
+                    <pic:cNvPr id="9002" name="factoryio_configuracion_modbus.png"/>
+                    <pic:cNvPicPr/>
+                  </pic:nvPicPr>
+                  <pic:blipFill>
+                    <a:blip r:embed="rIdImgFio"/>
+                    <a:stretch>
+                      <a:fillRect/>
+                    </a:stretch>
+                  </pic:blipFill>
+                  <pic:spPr>
+                    <a:xfrm>
+                      <a:off x="0" y="0"/>
+                      <a:ext cx="2377440" cy="2925378"/>
+                    </a:xfrm>
+                    <a:prstGeom prst="rect">
+                      <a:avLst/>
+                    </a:prstGeom>
+                  </pic:spPr>
+                </pic:pic>
+              </a:graphicData>
+            </a:graphic>
+          </wp:inline>
+        </w:drawing>
+      </w:r>
+    </w:p>
+    <w:p>
+      <w:pPr>
+        <w:spacing w:before="0" w:after="120"/>
+        <w:jc w:val="center"/>
+      </w:pPr>
+      <w:r>
+        <w:rPr>
+          <w:rFonts w:ascii="Segoe UI" w:hAnsi="Segoe UI"/>
+          <w:i/>
+          <w:color w:val="64748B"/>
+          <w:sz w:val="18"/>
+        </w:rPr>
+        <w:t>Figura 2. Configuración del driver Modbus TCP/IP Client en Factory I/O.</w:t>
+      </w:r>
+    </w:p>
+    <w:p>
+      <w:pPr>
+        <w:pStyle w:val="ListBullet"/>
+        <w:spacing w:before="40" w:after="80" w:line="276" w:lineRule="auto"/>
+      </w:pPr>
+      <w:r>
+        <w:rPr>
+          <w:rFonts w:ascii="Segoe UI" w:hAnsi="Segoe UI"/>
+          <w:b/>
+          <w:color w:val="0D233A"/>
+          <w:sz w:val="21"/>
+        </w:rPr>
+        <w:t xml:space="preserve">Equivalencias con el código del ESP32: </w:t>
+      </w:r>
+      <w:r>
+        <w:rPr>
+          <w:rFonts w:ascii="Segoe UI" w:hAnsi="Segoe UI"/>
+          <w:color w:val="2D3748"/>
+          <w:sz w:val="21"/>
+        </w:rPr>
+        <w:t xml:space="preserve">estos son los nombres de la ventana de arriba (I/O Points) y el registro Modbus que usa el programa.</w:t>
+      </w:r>
+    </w:p>
+    <w:p>
+      <w:pPr>
+        <w:pStyle w:val="ListBullet"/>
+        <w:spacing w:before="40" w:after="80" w:line="276" w:lineRule="auto"/>
+      </w:pPr>
+      <w:r>
+        <w:rPr>
+          <w:rFonts w:ascii="Segoe UI" w:hAnsi="Segoe UI"/>
+          <w:b/>
+          <w:color w:val="0D233A"/>
+          <w:sz w:val="21"/>
+        </w:rPr>
+        <w:t xml:space="preserve">   • Digital Outputs → Coil 0 (mb.Coil): </w:t>
+      </w:r>
+      <w:r>
+        <w:rPr>
+          <w:rFonts w:ascii="Segoe UI" w:hAnsi="Segoe UI"/>
+          <w:color w:val="2D3748"/>
+          <w:sz w:val="21"/>
+        </w:rPr>
+        <w:t xml:space="preserve">sensor digital; Factory I/O lo escribe al ESP32.</w:t>
+      </w:r>
+    </w:p>
+    <w:p>
+      <w:pPr>
+        <w:pStyle w:val="ListBullet"/>
+        <w:spacing w:before="40" w:after="80" w:line="276" w:lineRule="auto"/>
+      </w:pPr>
+      <w:r>
+        <w:rPr>
+          <w:rFonts w:ascii="Segoe UI" w:hAnsi="Segoe UI"/>
+          <w:b/>
+          <w:color w:val="0D233A"/>
+          <w:sz w:val="21"/>
+        </w:rPr>
+        <w:t xml:space="preserve">   • Digital Inputs → Discrete Input 0 (mb.Ists): </w:t>
+      </w:r>
+      <w:r>
+        <w:rPr>
+          <w:rFonts w:ascii="Segoe UI" w:hAnsi="Segoe UI"/>
+          <w:color w:val="2D3748"/>
+          <w:sz w:val="21"/>
+        </w:rPr>
+        <w:t xml:space="preserve">actuador digital; Factory I/O lo lee del ESP32.</w:t>
+      </w:r>
+    </w:p>
+    <w:p>
+      <w:pPr>
+        <w:pStyle w:val="ListBullet"/>
+        <w:spacing w:before="40" w:after="80" w:line="276" w:lineRule="auto"/>
+      </w:pPr>
+      <w:r>
+        <w:rPr>
+          <w:rFonts w:ascii="Segoe UI" w:hAnsi="Segoe UI"/>
+          <w:b/>
+          <w:color w:val="0D233A"/>
+          <w:sz w:val="21"/>
+        </w:rPr>
+        <w:t xml:space="preserve">   • Register Outputs → Holding Register 0 (mb.Hreg): </w:t>
+      </w:r>
+      <w:r>
+        <w:rPr>
+          <w:rFonts w:ascii="Segoe UI" w:hAnsi="Segoe UI"/>
+          <w:color w:val="2D3748"/>
+          <w:sz w:val="21"/>
+        </w:rPr>
+        <w:t xml:space="preserve">sensor analógico; Factory I/O lo escribe al ESP32.</w:t>
+      </w:r>
+    </w:p>
+    <w:p>
+      <w:pPr>
+        <w:pStyle w:val="ListBullet"/>
+        <w:spacing w:before="40" w:after="80" w:line="276" w:lineRule="auto"/>
+      </w:pPr>
+      <w:r>
+        <w:rPr>
+          <w:rFonts w:ascii="Segoe UI" w:hAnsi="Segoe UI"/>
+          <w:b/>
+          <w:color w:val="0D233A"/>
+          <w:sz w:val="21"/>
+        </w:rPr>
+        <w:t xml:space="preserve">   • Register Inputs → Input Register 0 (mb.Ireg): </w:t>
+      </w:r>
+      <w:r>
+        <w:rPr>
+          <w:rFonts w:ascii="Segoe UI" w:hAnsi="Segoe UI"/>
+          <w:color w:val="2D3748"/>
+          <w:sz w:val="21"/>
+        </w:rPr>
+        <w:t xml:space="preserve">actuador analógico; Factory I/O lo lee del ESP32.</w:t>
       </w:r>
     </w:p>
     <w:p>
@@ -2630,7 +2803,7 @@
           <w:color w:val="0D233A"/>
           <w:sz w:val="21"/>
         </w:rPr>
-        <w:t xml:space="preserve">2. Holding Registers (Inputs analógicos de FIO): </w:t>
+        <w:t xml:space="preserve">2. I/O Config: </w:t>
       </w:r>
       <w:r>
         <w:rPr>
@@ -2638,7 +2811,7 @@
           <w:color w:val="2D3748"/>
           <w:sz w:val="21"/>
         </w:rPr>
-        <w:t>Asegúrate de que 'Count' sea al menos 2 y cambia 'Scale' a 100.</w:t>
+        <w:t xml:space="preserve">Deja 'Read Register' en Input Registers y cambia 'Scale' a 100 (es un único campo para todos los registros).</w:t>
       </w:r>
     </w:p>
     <w:p>
@@ -2653,7 +2826,7 @@
           <w:color w:val="0D233A"/>
           <w:sz w:val="21"/>
         </w:rPr>
-        <w:t xml:space="preserve">3. Input Registers (Outputs analógicos de FIO): </w:t>
+        <w:t xml:space="preserve">3. I/O Points: </w:t>
       </w:r>
       <w:r>
         <w:rPr>
@@ -2661,7 +2834,7 @@
           <w:color w:val="2D3748"/>
           <w:sz w:val="21"/>
         </w:rPr>
-        <w:t>Asegúrate de que 'Count' sea al menos 2 y cambia 'Scale' a 100.</w:t>
+        <w:t xml:space="preserve">En 'Register Outputs' (Holding Registers, sensores) y 'Register Inputs' (Input Registers, actuadores) usa Offset 0 y un Count de al menos 2 (por defecto aparecen 8).</w:t>
       </w:r>
     </w:p>
     <w:p>

</xml_diff>

<commit_message>
Corrige la escritura de coils desde Factory I/O y hace independientes sensor y actuador
- Define todo el rango de registros (16 coils/discrete inputs, 8 holding/input registers):
  la librería rechaza escrituras multi-coil si falta alguna dirección del bloque
- El actuador depende solo del pulsador físico; el sensor virtual solo enciende el LED
- README y guía docx actualizados (código y fila nueva en diagnóstico)
</commit_message>
<xml_diff>
--- a/guia_esp32_factory_io.docx
+++ b/guia_esp32_factory_io.docx
@@ -1841,9 +1841,11 @@
               <w:br/>
               <w:t xml:space="preserve">  // Dar de alta registros digitales en memoria</w:t>
               <w:br/>
-              <w:t xml:space="preserve">  mb.addCoil(COIL_SENSOR_FIO, false); // Recibe sensor de Factory IO</w:t>
+              <w:t xml:space="preserve">  // Factory IO escribe/lee todos sus puntos en una sola petición: define todos (Count del driver) o se rechaza.</w:t>
               <w:br/>
-              <w:t xml:space="preserve">  mb.addIsts(ISTS_MOTOR_FIO, false);  // Envía mando de actuador a Factory IO</w:t>
+              <w:t xml:space="preserve">  mb.addCoil(COIL_SENSOR_FIO, false, 16); // Recibe sensor de Factory IO (Coil 0 a 15)</w:t>
+              <w:br/>
+              <w:t xml:space="preserve">  mb.addIsts(ISTS_MOTOR_FIO, false, 16);  // Envía mando de actuador a Factory IO</w:t>
               <w:br/>
               <w:t>}</w:t>
               <w:br/>
@@ -1870,9 +1872,9 @@
               <w:t xml:space="preserve">  digitalWrite(PIN_LED_ESTADO, cajaDetectada ? HIGH : LOW);</w:t>
               <w:br/>
               <w:br/>
-              <w:t xml:space="preserve">  // C) Lógica: Activar la banda si el sensor detecta caja O si se presiona el botón físico</w:t>
+              <w:t xml:space="preserve">  // C) Lógica independiente: la banda solo depende del pulsador físico (el sensor solo enciende el LED)</w:t>
               <w:br/>
-              <w:t xml:space="preserve">  if (cajaDetectada || botonPresionado) {</w:t>
+              <w:t xml:space="preserve">  if (botonPresionado) {</w:t>
               <w:br/>
               <w:t xml:space="preserve">    mb.Ists(ISTS_MOTOR_FIO, true);  // Enciende Output (Input 0) en Factory IO</w:t>
               <w:br/>
@@ -3006,13 +3008,15 @@
               <w:br/>
               <w:t xml:space="preserve">  // Inicializar los 4 tipos de registros en la tabla Modbus del ESP32</w:t>
               <w:br/>
-              <w:t xml:space="preserve">  mb.addCoil(COIL_SENSOR_DIGITAL, false);</w:t>
+              <w:t xml:space="preserve">  // Factory IO escribe/lee todos sus puntos en una sola petición: define todos (Count del driver) o se rechaza.</w:t>
               <w:br/>
-              <w:t xml:space="preserve">  mb.addIsts(ISTS_ACTUADOR_DIG, false);</w:t>
+              <w:t xml:space="preserve">  mb.addCoil(COIL_SENSOR_DIGITAL, false, 16);</w:t>
               <w:br/>
-              <w:t xml:space="preserve">  mb.addHreg(HREG_SENSOR_ANALOG, 0); // Recibirá 0 - 1000 desde Factory IO (Scale = 100)</w:t>
+              <w:t xml:space="preserve">  mb.addIsts(ISTS_ACTUADOR_DIG, false, 16);</w:t>
               <w:br/>
-              <w:t xml:space="preserve">  mb.addIreg(IREG_POT_ESP32, 0);     // Enviará 0 - 1000 hacia Factory IO (Scale = 100)</w:t>
+              <w:t xml:space="preserve">  mb.addHreg(HREG_SENSOR_ANALOG, 0, 8); // Recibirá 0 - 1000 desde Factory IO (Scale = 100)</w:t>
+              <w:br/>
+              <w:t xml:space="preserve">  mb.addIreg(IREG_POT_ESP32, 0, 8);     // Enviará 0 - 1000 hacia Factory IO (Scale = 100)</w:t>
               <w:br/>
               <w:t>}</w:t>
               <w:br/>
@@ -3037,7 +3041,7 @@
               <w:br/>
               <w:t xml:space="preserve">  digitalWrite(PIN_LED_DIGITAL, sensorVirtual ? HIGH : LOW);</w:t>
               <w:br/>
-              <w:t xml:space="preserve">  mb.Ists(ISTS_ACTUADOR_DIG, (sensorVirtual || botonFisico));</w:t>
+              <w:t xml:space="preserve">  mb.Ists(ISTS_ACTUADOR_DIG, botonFisico); // El actuador solo depende del pulsador (independiente del sensor)</w:t>
               <w:br/>
               <w:br/>
               <w:t xml:space="preserve">  // ==========================================================</w:t>
@@ -3628,6 +3632,84 @@
           </w:p>
         </w:tc>
       </w:tr>
+      <w:tr>
+        <w:tc>
+          <w:tcPr>
+            <w:tcW w:type="dxa" w:w="3312"/>
+            <w:shd w:fill="FFFFFF"/>
+            <w:tcMar>
+              <w:top w:w="100" w:type="dxa"/>
+              <w:bottom w:w="100" w:type="dxa"/>
+              <w:left w:w="140" w:type="dxa"/>
+              <w:right w:w="140" w:type="dxa"/>
+            </w:tcMar>
+          </w:tcPr>
+          <w:p>
+            <w:pPr>
+              <w:spacing w:before="0" w:after="0"/>
+            </w:pPr>
+            <w:r>
+              <w:rPr>
+                <w:rFonts w:ascii="Segoe UI" w:hAnsi="Segoe UI"/>
+                <w:b/>
+                <w:color w:val="0D233A"/>
+                <w:sz w:val="19"/>
+              </w:rPr>
+              <w:t>El actuador responde pero el sensor de Factory I/O nunca llega al ESP32 (el Coil queda en 0)</w:t>
+            </w:r>
+          </w:p>
+        </w:tc>
+        <w:tc>
+          <w:tcPr>
+            <w:tcW w:type="dxa" w:w="3312"/>
+            <w:shd w:fill="FFFFFF"/>
+            <w:tcMar>
+              <w:top w:w="100" w:type="dxa"/>
+              <w:bottom w:w="100" w:type="dxa"/>
+              <w:left w:w="140" w:type="dxa"/>
+              <w:right w:w="140" w:type="dxa"/>
+            </w:tcMar>
+          </w:tcPr>
+          <w:p>
+            <w:pPr>
+              <w:spacing w:before="0" w:after="0"/>
+            </w:pPr>
+            <w:r>
+              <w:rPr>
+                <w:rFonts w:ascii="Segoe UI" w:hAnsi="Segoe UI"/>
+                <w:color w:val="2D3748"/>
+                <w:sz w:val="19"/>
+              </w:rPr>
+              <w:t>El ESP32 define solo el Coil 0, pero Factory I/O escribe los 16 coils en una sola petición y la librería rechaza la escritura si falta alguno.</w:t>
+            </w:r>
+          </w:p>
+        </w:tc>
+        <w:tc>
+          <w:tcPr>
+            <w:tcW w:type="dxa" w:w="3312"/>
+            <w:shd w:fill="FFFFFF"/>
+            <w:tcMar>
+              <w:top w:w="100" w:type="dxa"/>
+              <w:bottom w:w="100" w:type="dxa"/>
+              <w:left w:w="140" w:type="dxa"/>
+              <w:right w:w="140" w:type="dxa"/>
+            </w:tcMar>
+          </w:tcPr>
+          <w:p>
+            <w:pPr>
+              <w:spacing w:before="0" w:after="0"/>
+            </w:pPr>
+            <w:r>
+              <w:rPr>
+                <w:rFonts w:ascii="Segoe UI" w:hAnsi="Segoe UI"/>
+                <w:color w:val="2D3748"/>
+                <w:sz w:val="19"/>
+              </w:rPr>
+              <w:t>En setup() define todo el rango: mb.addCoil(0, false, 16); mb.addIsts(0, false, 16); mb.addHreg(0, 0, 8); mb.addIreg(0, 0, 8); (o baja el Count del driver).</w:t>
+            </w:r>
+          </w:p>
+        </w:tc>
+      </w:tr>
     </w:tbl>
     <w:p>
       <w:pPr>

</xml_diff>

<commit_message>
Agrega imágenes del montaje en la escena y del mapeo Coil 0 / Input 0
- Escena con Start Button 0 (sensor) y Left Positioner 0 (actuador)
- Mapeo del pulsador al Coil 0 y del actuador al Input 0 en el driver
- README y guía docx actualizados; el paso 5 usa los mismos ejemplos
</commit_message>
<xml_diff>
--- a/guia_esp32_factory_io.docx
+++ b/guia_esp32_factory_io.docx
@@ -1434,6 +1434,87 @@
           <w:color w:val="0D233A"/>
           <w:sz w:val="21"/>
         </w:rPr>
+        <w:t xml:space="preserve">Montaje en la escena: </w:t>
+      </w:r>
+      <w:r>
+        <w:rPr>
+          <w:rFonts w:ascii="Segoe UI" w:hAnsi="Segoe UI"/>
+          <w:color w:val="2D3748"/>
+          <w:sz w:val="21"/>
+        </w:rPr>
+        <w:t xml:space="preserve">Coloca en la escena un pulsador (Start Button 0), que hará de sensor, y un posicionador (Left Positioner 0), que hará de actuador, como en la Figura 2.</w:t>
+      </w:r>
+    </w:p>
+    <w:p>
+      <w:pPr>
+        <w:keepNext/>
+        <w:spacing w:before="80" w:after="40"/>
+        <w:jc w:val="center"/>
+      </w:pPr>
+      <w:r>
+        <w:drawing>
+          <wp:inline distT="0" distB="0" distL="0" distR="0">
+            <wp:extent cx="4114800" cy="2835681"/>
+            <wp:docPr id="9003" name="Escena Factory IO" descr="Escena de Factory I/O con el pulsador Start Button 0 y el actuador Left Positioner 0"/>
+            <wp:cNvGraphicFramePr>
+              <a:graphicFrameLocks xmlns:a="http://schemas.openxmlformats.org/drawingml/2006/main" noChangeAspect="1"/>
+            </wp:cNvGraphicFramePr>
+            <a:graphic xmlns:a="http://schemas.openxmlformats.org/drawingml/2006/main">
+              <a:graphicData uri="http://schemas.openxmlformats.org/drawingml/2006/picture">
+                <pic:pic xmlns:pic="http://schemas.openxmlformats.org/drawingml/2006/picture">
+                  <pic:nvPicPr>
+                    <pic:cNvPr id="9003" name="Escena Factory IO"/>
+                    <pic:cNvPicPr/>
+                  </pic:nvPicPr>
+                  <pic:blipFill>
+                    <a:blip r:embed="rIdImgEscena"/>
+                    <a:stretch>
+                      <a:fillRect/>
+                    </a:stretch>
+                  </pic:blipFill>
+                  <pic:spPr>
+                    <a:xfrm>
+                      <a:off x="0" y="0"/>
+                      <a:ext cx="4114800" cy="2835681"/>
+                    </a:xfrm>
+                    <a:prstGeom prst="rect">
+                      <a:avLst/>
+                    </a:prstGeom>
+                  </pic:spPr>
+                </pic:pic>
+              </a:graphicData>
+            </a:graphic>
+          </wp:inline>
+        </w:drawing>
+      </w:r>
+    </w:p>
+    <w:p>
+      <w:pPr>
+        <w:spacing w:before="0" w:after="120"/>
+        <w:jc w:val="center"/>
+      </w:pPr>
+      <w:r>
+        <w:rPr>
+          <w:rFonts w:ascii="Segoe UI" w:hAnsi="Segoe UI"/>
+          <w:i/>
+          <w:color w:val="64748B"/>
+          <w:sz w:val="18"/>
+        </w:rPr>
+        <w:t>Figura 2. Montaje en la escena: Start Button 0 (sensor) y Left Positioner 0 (actuador).</w:t>
+      </w:r>
+    </w:p>
+    <w:p>
+      <w:pPr>
+        <w:pStyle w:val="ListBullet"/>
+        <w:spacing w:before="40" w:after="80" w:line="276" w:lineRule="auto"/>
+      </w:pPr>
+      <w:r>
+        <w:rPr>
+          <w:rFonts w:ascii="Segoe UI" w:hAnsi="Segoe UI"/>
+          <w:b/>
+          <w:color w:val="0D233A"/>
+          <w:sz w:val="21"/>
+        </w:rPr>
         <w:t xml:space="preserve">Paso 1: </w:t>
       </w:r>
       <w:r>
@@ -1534,7 +1615,7 @@
           <w:color w:val="2D3748"/>
           <w:sz w:val="21"/>
         </w:rPr>
-        <w:t>Regresa a la ventana del driver y arrastra un sensor (ej. Diffuse Sensor 0) a 'Coil 0', y un actuador (ej. Conveyor) a 'Input 0'.</w:t>
+        <w:t xml:space="preserve">Regresa a la ventana del driver y arrastra un sensor (ej. Start Button 0) a 'Coil 0' y un actuador (ej. Left Positioner 0 (Raise)) a 'Input 0', como en la Figura 4.</w:t>
       </w:r>
     </w:p>
     <w:p>
@@ -1592,7 +1673,65 @@
           <w:color w:val="64748B"/>
           <w:sz w:val="18"/>
         </w:rPr>
-        <w:t>Figura 2. Configuración del driver Modbus TCP/IP Client en Factory I/O.</w:t>
+        <w:t>Figura 3. Configuración del driver Modbus TCP/IP Client en Factory I/O.</w:t>
+      </w:r>
+    </w:p>
+    <w:p>
+      <w:pPr>
+        <w:keepNext/>
+        <w:spacing w:before="80" w:after="40"/>
+        <w:jc w:val="center"/>
+      </w:pPr>
+      <w:r>
+        <w:drawing>
+          <wp:inline distT="0" distB="0" distL="0" distR="0">
+            <wp:extent cx="5486400" cy="2434189"/>
+            <wp:docPr id="9004" name="Mapeo Coil 0 e Input 0" descr="Driver Modbus TCP/IP Client con Start Button 0 en Coil 0 y Left Positioner 0 (Raise) en Input 0"/>
+            <wp:cNvGraphicFramePr>
+              <a:graphicFrameLocks xmlns:a="http://schemas.openxmlformats.org/drawingml/2006/main" noChangeAspect="1"/>
+            </wp:cNvGraphicFramePr>
+            <a:graphic xmlns:a="http://schemas.openxmlformats.org/drawingml/2006/main">
+              <a:graphicData uri="http://schemas.openxmlformats.org/drawingml/2006/picture">
+                <pic:pic xmlns:pic="http://schemas.openxmlformats.org/drawingml/2006/picture">
+                  <pic:nvPicPr>
+                    <pic:cNvPr id="9004" name="Mapeo Coil 0 e Input 0"/>
+                    <pic:cNvPicPr/>
+                  </pic:nvPicPr>
+                  <pic:blipFill>
+                    <a:blip r:embed="rIdImgMapeo"/>
+                    <a:stretch>
+                      <a:fillRect/>
+                    </a:stretch>
+                  </pic:blipFill>
+                  <pic:spPr>
+                    <a:xfrm>
+                      <a:off x="0" y="0"/>
+                      <a:ext cx="5486400" cy="2434189"/>
+                    </a:xfrm>
+                    <a:prstGeom prst="rect">
+                      <a:avLst/>
+                    </a:prstGeom>
+                  </pic:spPr>
+                </pic:pic>
+              </a:graphicData>
+            </a:graphic>
+          </wp:inline>
+        </w:drawing>
+      </w:r>
+    </w:p>
+    <w:p>
+      <w:pPr>
+        <w:spacing w:before="0" w:after="120"/>
+        <w:jc w:val="center"/>
+      </w:pPr>
+      <w:r>
+        <w:rPr>
+          <w:rFonts w:ascii="Segoe UI" w:hAnsi="Segoe UI"/>
+          <w:i/>
+          <w:color w:val="64748B"/>
+          <w:sz w:val="18"/>
+        </w:rPr>
+        <w:t>Figura 4. Mapeo: Start Button 0 en Coil 0 (izquierda) y Left Positioner 0 (Raise) en Input 0 (derecha).</w:t>
       </w:r>
     </w:p>
     <w:p>

</xml_diff>